<commit_message>
now i know my abc
</commit_message>
<xml_diff>
--- a/alpha.docx
+++ b/alpha.docx
@@ -11,6 +11,39 @@
       </w:r>
       <w:r>
         <w:t>BCDEFG</w:t>
+      </w:r>
+    </w:p>
+    <w:p>
+      <w:r>
+        <w:rPr>
+          <w:rFonts w:hint="eastAsia"/>
+        </w:rPr>
+        <w:t>H</w:t>
+      </w:r>
+      <w:r>
+        <w:t>IJK</w:t>
+      </w:r>
+    </w:p>
+    <w:p>
+      <w:r>
+        <w:rPr>
+          <w:rFonts w:hint="eastAsia"/>
+        </w:rPr>
+        <w:t>Q</w:t>
+      </w:r>
+      <w:r>
+        <w:t>RS</w:t>
+      </w:r>
+    </w:p>
+    <w:p>
+      <w:r>
+        <w:rPr>
+          <w:rFonts w:hint="eastAsia"/>
+        </w:rPr>
+        <w:t>L</w:t>
+      </w:r>
+      <w:r>
+        <w:t>LLL</w:t>
       </w:r>
     </w:p>
     <w:p>
@@ -20,35 +53,7 @@
         </w:rPr>
       </w:pPr>
       <w:r>
-        <w:rPr>
-          <w:rFonts w:hint="eastAsia"/>
-        </w:rPr>
-        <w:t>H</w:t>
-      </w:r>
-      <w:r>
-        <w:t>IJK</w:t>
-      </w:r>
-    </w:p>
-    <w:p>
-      <w:r>
-        <w:rPr>
-          <w:rFonts w:hint="eastAsia"/>
-        </w:rPr>
-        <w:t>Q</w:t>
-      </w:r>
-      <w:r>
-        <w:t>RS</w:t>
-      </w:r>
-    </w:p>
-    <w:p>
-      <w:r>
-        <w:rPr>
-          <w:rFonts w:hint="eastAsia"/>
-        </w:rPr>
-        <w:t>L</w:t>
-      </w:r>
-      <w:r>
-        <w:t>LLL</w:t>
+        <w:t>Now I know my ABC</w:t>
       </w:r>
     </w:p>
     <w:sectPr>

</xml_diff>